<commit_message>
mais informacoes sobre arquitetura
</commit_message>
<xml_diff>
--- a/arquitetura/docs/arquitetura dados.docx
+++ b/arquitetura/docs/arquitetura dados.docx
@@ -100,7 +100,24 @@
         <w:t xml:space="preserve"> </w:t>
       </w:r>
     </w:p>
-    <w:p/>
+    <w:p>
+      <w:r>
+        <w:t>Para dados Streaming ou Kafka streaming como pix é</w:t>
+      </w:r>
+      <w:r>
+        <w:t xml:space="preserve"> em tempo real.</w:t>
+      </w:r>
+    </w:p>
+    <w:p>
+      <w:r>
+        <w:t xml:space="preserve">Os Datamarts para time de marketing, antifraude, risco de crédito e financeiro </w:t>
+      </w:r>
+    </w:p>
+    <w:p>
+      <w:r>
+        <w:t>Criando views para às regras de negócio para cada time.</w:t>
+      </w:r>
+    </w:p>
     <w:p/>
     <w:p/>
     <w:p/>

</xml_diff>